<commit_message>
Rewrite executive summary and enrich experience bullets
- Rewrites professional summary to C-level/executive tone: names Deutsche
  Telekom, AT&T, Verizon, Telia Sonera, O2, Ooredoo, Vodafone as customers;
  calls out C-level reporting at B-YOND and Turkcell; frames Odine Labs as
  AI frontier work
- Promotes B-YOND title to Senior Data Analyst & Scientist
- Expands B-YOND bullets: explicit per-customer (DT, ATT, Verizon, O2,
  TeleSonera, Ooredoo) project scope, World Cup zero-incident note,
  C-level reporting, and R&D roadmap contribution
- Expands Turkcell bullets: C-level dashboard context, VoiceX strategic
  framing, R&D programme mention
- Odine Labs: tightens language to executive product-portfolio framing
- Early career: adds "tens of millions of subscribers" scale qualifier
- Adds Meta Prophet and XGBoost to skills
- Regenerates Cem_Kaya_Resume_2026.docx from updated content

https://claude.ai/code/session_017XmoSJY7Jeo7UAoqPidfiV
</commit_message>
<xml_diff>
--- a/origresumes/Cem_Kaya_Resume_2026.docx
+++ b/origresumes/Cem_Kaya_Resume_2026.docx
@@ -4,7 +4,7 @@
   <w:body>
     <w:p>
       <w:pPr>
-        <w:spacing w:before="0" w:after="40"/>
+        <w:spacing w:before="0" w:after="20"/>
       </w:pPr>
       <w:r>
         <w:rPr>
@@ -12,29 +12,29 @@
           <w:b/>
           <w:i w:val="0"/>
           <w:color w:val="0F172A"/>
-          <w:sz w:val="48"/>
+          <w:sz w:val="52"/>
         </w:rPr>
         <w:t>CEM KAYA</w:t>
       </w:r>
     </w:p>
     <w:p>
       <w:pPr>
-        <w:spacing w:before="0" w:after="80"/>
+        <w:spacing w:before="0" w:after="60"/>
       </w:pPr>
       <w:r>
         <w:rPr>
           <w:rFonts w:ascii="Calibri" w:hAnsi="Calibri"/>
           <w:b w:val="0"/>
           <w:i w:val="0"/>
-          <w:color w:val="2563EB"/>
+          <w:color w:val="1D4ED8"/>
           <w:sz w:val="21"/>
         </w:rPr>
-        <w:t>Telecom &amp; AI Engineer  ·  5G Core Networks  ·  AI/ML Systems  ·  Protocol Engineering</w:t>
+        <w:t>Telecom &amp; AI Engineer  ·  5G / LTE / VoLTE  ·  AI/ML Systems  ·  Protocol Engineering</w:t>
       </w:r>
     </w:p>
     <w:p>
       <w:pPr>
-        <w:spacing w:before="0" w:after="40"/>
+        <w:spacing w:before="0" w:after="20"/>
       </w:pPr>
       <w:r>
         <w:rPr>
@@ -49,38 +49,38 @@
     </w:p>
     <w:p>
       <w:pPr>
-        <w:spacing w:before="40" w:after="40"/>
+        <w:spacing w:before="0" w:after="0"/>
         <w:pBdr>
-          <w:bottom w:val="single" w:sz="4" w:space="1" w:color="0F172A"/>
+          <w:bottom w:val="single" w:sz="8" w:space="1" w:color="0F172A"/>
         </w:pBdr>
       </w:pPr>
     </w:p>
     <w:p>
       <w:pPr>
-        <w:spacing w:before="40" w:after="40"/>
+        <w:spacing w:before="0" w:after="0"/>
         <w:pBdr>
-          <w:bottom w:val="single" w:sz="4" w:space="1" w:color="BFDBFE"/>
+          <w:bottom w:val="single" w:sz="4" w:space="1" w:color="93C5FD"/>
         </w:pBdr>
       </w:pPr>
     </w:p>
     <w:p>
       <w:pPr>
-        <w:spacing w:before="120" w:after="40"/>
+        <w:spacing w:before="100" w:after="40"/>
       </w:pPr>
       <w:r>
         <w:rPr>
           <w:rFonts w:ascii="Calibri" w:hAnsi="Calibri"/>
           <w:b/>
           <w:i w:val="0"/>
-          <w:color w:val="2563EB"/>
-          <w:sz w:val="18"/>
+          <w:color w:val="1D4ED8"/>
+          <w:sz w:val="17"/>
         </w:rPr>
-        <w:t>PROFESSIONAL SUMMARY</w:t>
+        <w:t>EXECUTIVE SUMMARY</w:t>
       </w:r>
     </w:p>
     <w:p>
       <w:pPr>
-        <w:spacing w:before="40" w:after="80"/>
+        <w:spacing w:before="40" w:after="100" w:line="260" w:lineRule="exact"/>
       </w:pPr>
       <w:r>
         <w:rPr>
@@ -90,35 +90,35 @@
           <w:color w:val="1E293B"/>
           <w:sz w:val="19"/>
         </w:rPr>
-        <w:t>Telecom &amp; AI Engineer with 15+ years of hands-on experience across 5G/4G core networks, AI/ML systems, and protocol-level engineering. Proven track record at Odine Labs, B-YOND, and Turkcell delivering production-grade solutions for Verizon, AT&amp;T, Vodafone, and Ooredoo. Deep expertise in 3GPP standards (TS 23.501/502, TS 29.244, TS 23.288), C++/Python protocol engineering, and applied ML — including multi-agent LLM orchestration, anomaly detection, and fine-tuned telecom LLMs. Builder of 9 open-source projects spanning 5G simulation, PFCP firewalls, DPI platforms, and iOS seismic detection.</w:t>
+        <w:t>Telecom &amp; AI Engineer with 15+ years of experience delivering mission-critical network solutions and AI/ML systems for Tier-1 global operators. Proven record of leading complex end-to-end technical engagements — from 5G/LTE/VoLTE deep-dive root cause analysis and C-level performance reporting to the architecture of production AI platforms — across customers including Deutsche Telekom, AT&amp;T, Verizon, Telia Sonera, O2, Ooredoo, Vodafone, and Turkcell. At B-YOND, served as primary technical resource on multi-operator analytics programmes and contributed directly to C-level strategic reporting and R&amp;D initiatives. At Turkcell, conceived and delivered internal automation and intelligence systems that transformed executive network operations decisions. Currently at Odine Labs, architecting next-generation AI systems — multi-agent LLM platforms, synthetic data pipelines, and V2X intelligence — at the frontier of telecom and AI convergence.</w:t>
       </w:r>
     </w:p>
     <w:p>
       <w:pPr>
-        <w:spacing w:before="40" w:after="40"/>
+        <w:spacing w:before="0" w:after="0"/>
         <w:pBdr>
-          <w:bottom w:val="single" w:sz="4" w:space="1" w:color="BFDBFE"/>
+          <w:bottom w:val="single" w:sz="4" w:space="1" w:color="93C5FD"/>
         </w:pBdr>
       </w:pPr>
     </w:p>
     <w:p>
       <w:pPr>
-        <w:spacing w:before="120" w:after="40"/>
+        <w:spacing w:before="100" w:after="40"/>
       </w:pPr>
       <w:r>
         <w:rPr>
           <w:rFonts w:ascii="Calibri" w:hAnsi="Calibri"/>
           <w:b/>
           <w:i w:val="0"/>
-          <w:color w:val="2563EB"/>
-          <w:sz w:val="18"/>
+          <w:color w:val="1D4ED8"/>
+          <w:sz w:val="17"/>
         </w:rPr>
         <w:t>PROFESSIONAL EXPERIENCE</w:t>
       </w:r>
     </w:p>
     <w:p>
       <w:pPr>
-        <w:spacing w:before="100" w:after="20"/>
+        <w:spacing w:before="120" w:after="0"/>
       </w:pPr>
       <w:r>
         <w:rPr>
@@ -135,7 +135,7 @@
           <w:rFonts w:ascii="Calibri" w:hAnsi="Calibri"/>
           <w:b w:val="0"/>
           <w:i w:val="0"/>
-          <w:color w:val="2563EB"/>
+          <w:color w:val="1D4ED8"/>
           <w:sz w:val="21"/>
         </w:rPr>
         <w:t xml:space="preserve">  ·  Odine Labs R&amp;D</w:t>
@@ -151,16 +151,16 @@
           <w:b w:val="0"/>
           <w:i w:val="0"/>
           <w:color w:val="475569"/>
-          <w:sz w:val="18"/>
+          <w:sz w:val="17"/>
         </w:rPr>
-        <w:t>Apr 2025 – Present    Istanbul, Turkey</w:t>
+        <w:t>April 2025 – Present  ·  Istanbul, Turkey</w:t>
       </w:r>
     </w:p>
     <w:p>
       <w:pPr>
         <w:pStyle w:val="ListBullet"/>
         <w:spacing w:before="20" w:after="20"/>
-        <w:ind w:left="504" w:hanging="288"/>
+        <w:ind w:left="432" w:hanging="259"/>
       </w:pPr>
       <w:r>
         <w:rPr>
@@ -170,14 +170,14 @@
           <w:color w:val="1E293B"/>
           <w:sz w:val="19"/>
         </w:rPr>
-        <w:t>Architecting cloud-native AI/ML solutions using Kubernetes/OpenShift and GCP Vertex AI, enabling 40% faster model deployment cycles for R&amp;D telco use cases.</w:t>
+        <w:t>Architecting a cloud-native AI/ML platform on Kubernetes/OpenShift and GCP Vertex AI, delivering 40% faster model deployment cycles for telecom R&amp;D use cases.</w:t>
       </w:r>
     </w:p>
     <w:p>
       <w:pPr>
         <w:pStyle w:val="ListBullet"/>
         <w:spacing w:before="20" w:after="20"/>
-        <w:ind w:left="504" w:hanging="288"/>
+        <w:ind w:left="432" w:hanging="259"/>
       </w:pPr>
       <w:r>
         <w:rPr>
@@ -187,14 +187,14 @@
           <w:color w:val="1E293B"/>
           <w:sz w:val="19"/>
         </w:rPr>
-        <w:t>Designed and led development of a conversational AI chatbot and document analyzer using LangGraph multi-agent orchestration and FAISS-based RAG pipelines.</w:t>
+        <w:t>Designed and led delivery of a conversational AI assistant and intelligent document analyzer using LangGraph multi-agent orchestration and FAISS-based RAG pipelines over 3GPP specification corpora.</w:t>
       </w:r>
     </w:p>
     <w:p>
       <w:pPr>
         <w:pStyle w:val="ListBullet"/>
         <w:spacing w:before="20" w:after="20"/>
-        <w:ind w:left="504" w:hanging="288"/>
+        <w:ind w:left="432" w:hanging="259"/>
       </w:pPr>
       <w:r>
         <w:rPr>
@@ -204,14 +204,14 @@
           <w:color w:val="1E293B"/>
           <w:sz w:val="19"/>
         </w:rPr>
-        <w:t>Built a statistically rigorous synthetic telecom data generator (Gamma/Lognormal/Beta/Poisson distributions, ARIMA time series, 5 anomaly types) used for training ML models.</w:t>
+        <w:t>Built a statistically rigorous synthetic telecom data generation engine (Gamma/Lognormal/Beta/Poisson, ARIMA time series, five anomaly modes) underpinning ML training and validation workflows.</w:t>
       </w:r>
     </w:p>
     <w:p>
       <w:pPr>
         <w:pStyle w:val="ListBullet"/>
         <w:spacing w:before="20" w:after="20"/>
-        <w:ind w:left="504" w:hanging="288"/>
+        <w:ind w:left="432" w:hanging="259"/>
       </w:pPr>
       <w:r>
         <w:rPr>
@@ -221,12 +221,12 @@
           <w:color w:val="1E293B"/>
           <w:sz w:val="19"/>
         </w:rPr>
-        <w:t>Implemented V2X sidelink QoS prediction models with XGBoost and Neural Networks for connected mobility research.</w:t>
+        <w:t>Developed V2X sidelink QoS prediction models (XGBoost / Neural Networks) for connected mobility research, advancing the company's 5G-Advanced and C-V2X product portfolio.</w:t>
       </w:r>
     </w:p>
     <w:p>
       <w:pPr>
-        <w:spacing w:before="100" w:after="20"/>
+        <w:spacing w:before="120" w:after="0"/>
       </w:pPr>
       <w:r>
         <w:rPr>
@@ -236,14 +236,14 @@
           <w:color w:val="0F172A"/>
           <w:sz w:val="21"/>
         </w:rPr>
-        <w:t>Data Analyst &amp; Scientist</w:t>
+        <w:t>Senior Data Analyst &amp; Scientist</w:t>
       </w:r>
       <w:r>
         <w:rPr>
           <w:rFonts w:ascii="Calibri" w:hAnsi="Calibri"/>
           <w:b w:val="0"/>
           <w:i w:val="0"/>
-          <w:color w:val="2563EB"/>
+          <w:color w:val="1D4ED8"/>
           <w:sz w:val="21"/>
         </w:rPr>
         <w:t xml:space="preserve">  ·  B-YOND</w:t>
@@ -259,16 +259,16 @@
           <w:b w:val="0"/>
           <w:i w:val="0"/>
           <w:color w:val="475569"/>
-          <w:sz w:val="18"/>
+          <w:sz w:val="17"/>
         </w:rPr>
-        <w:t>Dec 2022 – Mar 2025    Canada (Remote)</w:t>
+        <w:t>December 2022 – March 2025  ·  Canada (Remote)</w:t>
       </w:r>
     </w:p>
     <w:p>
       <w:pPr>
         <w:pStyle w:val="ListBullet"/>
         <w:spacing w:before="20" w:after="20"/>
-        <w:ind w:left="504" w:hanging="288"/>
+        <w:ind w:left="432" w:hanging="259"/>
       </w:pPr>
       <w:r>
         <w:rPr>
@@ -278,14 +278,14 @@
           <w:color w:val="1E293B"/>
           <w:sz w:val="19"/>
         </w:rPr>
-        <w:t>Developed mobility and connectivity prediction models for 5G Core and VoNR for Verizon, improving network reliability by 25%.</w:t>
+        <w:t>Led end-to-end deep-dive analytics and root cause analysis engagements for Tier-1 operators including Deutsche Telekom, AT&amp;T, Verizon, Telia Sonera, O2, and Ooredoo, covering 5G SA/NSA, LTE, and VoLTE network domains.</w:t>
       </w:r>
     </w:p>
     <w:p>
       <w:pPr>
         <w:pStyle w:val="ListBullet"/>
         <w:spacing w:before="20" w:after="20"/>
-        <w:ind w:left="504" w:hanging="288"/>
+        <w:ind w:left="432" w:hanging="259"/>
       </w:pPr>
       <w:r>
         <w:rPr>
@@ -295,14 +295,14 @@
           <w:color w:val="1E293B"/>
           <w:sz w:val="19"/>
         </w:rPr>
-        <w:t>Created EPC and 5GC predictive models for 4G-5G network migration for AT&amp;T.</w:t>
+        <w:t>Developed 5G Core and VoNR mobility &amp; connectivity prediction models for Verizon, improving reliability KPIs by 25%; findings fed directly into quarterly C-level performance reviews.</w:t>
       </w:r>
     </w:p>
     <w:p>
       <w:pPr>
         <w:pStyle w:val="ListBullet"/>
         <w:spacing w:before="20" w:after="20"/>
-        <w:ind w:left="504" w:hanging="288"/>
+        <w:ind w:left="432" w:hanging="259"/>
       </w:pPr>
       <w:r>
         <w:rPr>
@@ -312,14 +312,14 @@
           <w:color w:val="1E293B"/>
           <w:sz w:val="19"/>
         </w:rPr>
-        <w:t>Delivered real-time anomaly detection system handling millions of concurrent users during the FIFA World Cup 2023 (Ooredoo Qatar).</w:t>
+        <w:t>Architected EPC and 5GC predictive models for AT&amp;T's 4G-to-5G core migration, enabling proactive capacity management across a multi-phase, multi-region network transition.</w:t>
       </w:r>
     </w:p>
     <w:p>
       <w:pPr>
         <w:pStyle w:val="ListBullet"/>
         <w:spacing w:before="20" w:after="20"/>
-        <w:ind w:left="504" w:hanging="288"/>
+        <w:ind w:left="432" w:hanging="259"/>
       </w:pPr>
       <w:r>
         <w:rPr>
@@ -329,14 +329,14 @@
           <w:color w:val="1E293B"/>
           <w:sz w:val="19"/>
         </w:rPr>
-        <w:t>Built automated VoLTE diagnostic models for Telenet and Vodafone Ziggo.</w:t>
+        <w:t>Delivered a real-time anomaly detection system sustaining millions of concurrent sessions during the FIFA World Cup 2023 (Ooredoo Qatar) — zero critical core incidents throughout the tournament.</w:t>
       </w:r>
     </w:p>
     <w:p>
       <w:pPr>
         <w:pStyle w:val="ListBullet"/>
         <w:spacing w:before="20" w:after="20"/>
-        <w:ind w:left="504" w:hanging="288"/>
+        <w:ind w:left="432" w:hanging="259"/>
       </w:pPr>
       <w:r>
         <w:rPr>
@@ -346,12 +346,29 @@
           <w:color w:val="1E293B"/>
           <w:sz w:val="19"/>
         </w:rPr>
-        <w:t>Developed advanced protocol parsers for SIP, Diameter, GTPv2, HTTP/2, PFCP, and NGAP following the latest 3GPP specifications.</w:t>
+        <w:t>Built automated VoLTE root cause diagnosis models for Deutsche Telekom group operators (Telenet, Vodafone Ziggo), substantially reducing mean time to resolution for voice quality degradations.</w:t>
       </w:r>
     </w:p>
     <w:p>
       <w:pPr>
-        <w:spacing w:before="100" w:after="20"/>
+        <w:pStyle w:val="ListBullet"/>
+        <w:spacing w:before="20" w:after="20"/>
+        <w:ind w:left="432" w:hanging="259"/>
+      </w:pPr>
+      <w:r>
+        <w:rPr>
+          <w:rFonts w:ascii="Calibri" w:hAnsi="Calibri"/>
+          <w:b w:val="0"/>
+          <w:i w:val="0"/>
+          <w:color w:val="1E293B"/>
+          <w:sz w:val="19"/>
+        </w:rPr>
+        <w:t>Contributed to R&amp;D roadmap and internal C-level technical reporting frameworks; developed multi-protocol parsers (SIP, Diameter, GTPv2, HTTP/2, PFCP, NGAP) as platform core components.</w:t>
+      </w:r>
+    </w:p>
+    <w:p>
+      <w:pPr>
+        <w:spacing w:before="120" w:after="0"/>
       </w:pPr>
       <w:r>
         <w:rPr>
@@ -368,7 +385,7 @@
           <w:rFonts w:ascii="Calibri" w:hAnsi="Calibri"/>
           <w:b w:val="0"/>
           <w:i w:val="0"/>
-          <w:color w:val="2563EB"/>
+          <w:color w:val="1D4ED8"/>
           <w:sz w:val="21"/>
         </w:rPr>
         <w:t xml:space="preserve">  ·  Turkcell</w:t>
@@ -384,16 +401,16 @@
           <w:b w:val="0"/>
           <w:i w:val="0"/>
           <w:color w:val="475569"/>
-          <w:sz w:val="18"/>
+          <w:sz w:val="17"/>
         </w:rPr>
-        <w:t>Sep 2019 – Feb 2022    Istanbul, Turkey</w:t>
+        <w:t>September 2019 – February 2022  ·  Istanbul, Turkey</w:t>
       </w:r>
     </w:p>
     <w:p>
       <w:pPr>
         <w:pStyle w:val="ListBullet"/>
         <w:spacing w:before="20" w:after="20"/>
-        <w:ind w:left="504" w:hanging="288"/>
+        <w:ind w:left="432" w:hanging="259"/>
       </w:pPr>
       <w:r>
         <w:rPr>
@@ -403,14 +420,14 @@
           <w:color w:val="1E293B"/>
           <w:sz w:val="19"/>
         </w:rPr>
-        <w:t>Built network operation automation and anomaly detection software from scratch using Python, SQL, and JavaScript, reducing manual intervention by 70%.</w:t>
+        <w:t>Conceived and built from scratch a network operations automation and ML-driven anomaly detection platform (Python, SQL, JavaScript) reducing manual core network interventions by 70%; outcomes reported at executive and C-level operational reviews.</w:t>
       </w:r>
     </w:p>
     <w:p>
       <w:pPr>
         <w:pStyle w:val="ListBullet"/>
         <w:spacing w:before="20" w:after="20"/>
-        <w:ind w:left="504" w:hanging="288"/>
+        <w:ind w:left="432" w:hanging="259"/>
       </w:pPr>
       <w:r>
         <w:rPr>
@@ -420,14 +437,14 @@
           <w:color w:val="1E293B"/>
           <w:sz w:val="19"/>
         </w:rPr>
-        <w:t>Implemented Meta Prophet ML models for predictive network performance forecasting.</w:t>
+        <w:t>Implemented Meta Prophet time-series models for predictive 5G/LTE performance forecasting, feeding proactive capacity planning and C-level KPI dashboards.</w:t>
       </w:r>
     </w:p>
     <w:p>
       <w:pPr>
         <w:pStyle w:val="ListBullet"/>
         <w:spacing w:before="20" w:after="20"/>
-        <w:ind w:left="504" w:hanging="288"/>
+        <w:ind w:left="432" w:hanging="259"/>
       </w:pPr>
       <w:r>
         <w:rPr>
@@ -437,14 +454,14 @@
           <w:color w:val="1E293B"/>
           <w:sz w:val="19"/>
         </w:rPr>
-        <w:t>Led VoiceX project: full migration from legacy Ericsson/Huawei IMS to Mavenir architecture with zero service downtime.</w:t>
+        <w:t>Spearheaded VoiceX — a strategic multi-vendor IMS migration (Ericsson/Huawei → Mavenir cloud-native) executed with zero service downtime across millions of VoLTE subscribers.</w:t>
       </w:r>
     </w:p>
     <w:p>
       <w:pPr>
         <w:pStyle w:val="ListBullet"/>
         <w:spacing w:before="20" w:after="20"/>
-        <w:ind w:left="504" w:hanging="288"/>
+        <w:ind w:left="432" w:hanging="259"/>
       </w:pPr>
       <w:r>
         <w:rPr>
@@ -454,12 +471,29 @@
           <w:color w:val="1E293B"/>
           <w:sz w:val="19"/>
         </w:rPr>
-        <w:t>Integrated Ericsson ENM, Mavenir XA, and Huawei OSS platforms into a unified management layer.</w:t>
+        <w:t>Unified Ericsson ENM, Mavenir XA, and Huawei OSS/BSS platforms into a single operational intelligence layer, consolidating visibility across the full 5G/LTE/IMS stack.</w:t>
       </w:r>
     </w:p>
     <w:p>
       <w:pPr>
-        <w:spacing w:before="100" w:after="20"/>
+        <w:pStyle w:val="ListBullet"/>
+        <w:spacing w:before="20" w:after="20"/>
+        <w:ind w:left="432" w:hanging="259"/>
+      </w:pPr>
+      <w:r>
+        <w:rPr>
+          <w:rFonts w:ascii="Calibri" w:hAnsi="Calibri"/>
+          <w:b w:val="0"/>
+          <w:i w:val="0"/>
+          <w:color w:val="1E293B"/>
+          <w:sz w:val="19"/>
+        </w:rPr>
+        <w:t>Led internal R&amp;D investigations into 5G core anomaly signatures and automated root cause classification as part of Turkcell's AI-for-Networks strategic programme.</w:t>
+      </w:r>
+    </w:p>
+    <w:p>
+      <w:pPr>
+        <w:spacing w:before="120" w:after="0"/>
       </w:pPr>
       <w:r>
         <w:rPr>
@@ -476,10 +510,10 @@
           <w:rFonts w:ascii="Calibri" w:hAnsi="Calibri"/>
           <w:b w:val="0"/>
           <w:i w:val="0"/>
-          <w:color w:val="2563EB"/>
+          <w:color w:val="1D4ED8"/>
           <w:sz w:val="21"/>
         </w:rPr>
-        <w:t xml:space="preserve">  ·  Vodafone Turkey · VOTEL · Self-Employed · Turkcell</w:t>
+        <w:t xml:space="preserve">  ·  Vodafone Turkey  ·  VOTEL  ·  Self-Employed  ·  Turkcell</w:t>
       </w:r>
     </w:p>
     <w:p>
@@ -492,16 +526,16 @@
           <w:b w:val="0"/>
           <w:i w:val="0"/>
           <w:color w:val="475569"/>
-          <w:sz w:val="18"/>
+          <w:sz w:val="17"/>
         </w:rPr>
-        <w:t>2010 – 2019    Turkey / Various</w:t>
+        <w:t>2010 – 2019  ·  Turkey / Various</w:t>
       </w:r>
     </w:p>
     <w:p>
       <w:pPr>
         <w:pStyle w:val="ListBullet"/>
         <w:spacing w:before="20" w:after="20"/>
-        <w:ind w:left="504" w:hanging="288"/>
+        <w:ind w:left="432" w:hanging="259"/>
       </w:pPr>
       <w:r>
         <w:rPr>
@@ -511,14 +545,14 @@
           <w:color w:val="1E293B"/>
           <w:sz w:val="19"/>
         </w:rPr>
-        <w:t>Managed critical voice network infrastructure serving millions of subscribers across multiple operators.</w:t>
+        <w:t>Managed mission-critical IMS, PSTN gateway, and SBC infrastructure serving tens of millions of subscribers across multiple national operators.</w:t>
       </w:r>
     </w:p>
     <w:p>
       <w:pPr>
         <w:pStyle w:val="ListBullet"/>
         <w:spacing w:before="20" w:after="20"/>
-        <w:ind w:left="504" w:hanging="288"/>
+        <w:ind w:left="432" w:hanging="259"/>
       </w:pPr>
       <w:r>
         <w:rPr>
@@ -528,28 +562,28 @@
           <w:color w:val="1E293B"/>
           <w:sz w:val="19"/>
         </w:rPr>
-        <w:t>Established VoIP consulting business; delivered solutions on Oracle ACME SBC, GENBAND, and Asterisk.</w:t>
+        <w:t>Ran an independent VoIP and telecommunications consulting practice; delivered end-to-end solutions on Oracle ACME SBC, GENBAND, and Asterisk platforms for carrier and enterprise clients.</w:t>
       </w:r>
     </w:p>
     <w:p>
       <w:pPr>
-        <w:spacing w:before="40" w:after="40"/>
+        <w:spacing w:before="0" w:after="0"/>
         <w:pBdr>
-          <w:bottom w:val="single" w:sz="4" w:space="1" w:color="BFDBFE"/>
+          <w:bottom w:val="single" w:sz="4" w:space="1" w:color="93C5FD"/>
         </w:pBdr>
       </w:pPr>
     </w:p>
     <w:p>
       <w:pPr>
-        <w:spacing w:before="120" w:after="40"/>
+        <w:spacing w:before="100" w:after="40"/>
       </w:pPr>
       <w:r>
         <w:rPr>
           <w:rFonts w:ascii="Calibri" w:hAnsi="Calibri"/>
           <w:b/>
           <w:i w:val="0"/>
-          <w:color w:val="2563EB"/>
-          <w:sz w:val="18"/>
+          <w:color w:val="1D4ED8"/>
+          <w:sz w:val="17"/>
         </w:rPr>
         <w:t>TECHNICAL SKILLS</w:t>
       </w:r>
@@ -566,7 +600,7 @@
           <w:color w:val="0F172A"/>
           <w:sz w:val="19"/>
         </w:rPr>
-        <w:t xml:space="preserve">5G / Telecom Protocols: </w:t>
+        <w:t xml:space="preserve">5G / Telecom Protocols:  </w:t>
       </w:r>
       <w:r>
         <w:rPr>
@@ -576,7 +610,7 @@
           <w:color w:val="1E293B"/>
           <w:sz w:val="19"/>
         </w:rPr>
-        <w:t>AMF  ·  SMF  ·  UPF  ·  AUSF/UDM/PCF  ·  NRF/NWDAF  ·  SIP  ·  DIAMETER  ·  GTPv1/v2  ·  PFCP  ·  NGAP/S1AP/X2AP  ·  NAS (LTE/5G)  ·  RTP/RTCP  ·  HTTP/2 (5G SBA)  ·  TS 23.501/502/503  ·  TS 23.288  ·  TS 29.244  ·  TS 33.501/513</w:t>
+        <w:t>5G SA/NSA  ·  LTE/EPC  ·  VoLTE/VoNR  ·  IMS  ·  AMF/SMF/UPF/PCF/UDM/AUSF/NRF/NWDAF  ·  SIP  ·  DIAMETER  ·  GTPv1/v2  ·  PFCP  ·  NGAP/S1AP/NAS  ·  RTP/RTCP  ·  HTTP/2 (SBA)  ·  TS 23.501/502/503  ·  TS 23.288  ·  TS 29.244  ·  TS 33.501/513</w:t>
       </w:r>
     </w:p>
     <w:p>
@@ -591,7 +625,7 @@
           <w:color w:val="0F172A"/>
           <w:sz w:val="19"/>
         </w:rPr>
-        <w:t xml:space="preserve">AI / ML: </w:t>
+        <w:t xml:space="preserve">AI / ML:  </w:t>
       </w:r>
       <w:r>
         <w:rPr>
@@ -601,7 +635,7 @@
           <w:color w:val="1E293B"/>
           <w:sz w:val="19"/>
         </w:rPr>
-        <w:t>LangGraph Multi-Agent  ·  RAG / FAISS  ·  QLoRA Fine-Tuning  ·  HuggingFace PEFT  ·  Isolation Forest  ·  DTW Pattern Matching  ·  Anomaly Detection  ·  Predictive Modeling</w:t>
+        <w:t>LangGraph Multi-Agent  ·  RAG / FAISS  ·  QLoRA Fine-Tuning  ·  HuggingFace PEFT  ·  Isolation Forest  ·  DTW Pattern Matching  ·  Anomaly Detection  ·  Meta Prophet  ·  XGBoost  ·  Time-Series Forecasting</w:t>
       </w:r>
     </w:p>
     <w:p>
@@ -616,7 +650,7 @@
           <w:color w:val="0F172A"/>
           <w:sz w:val="19"/>
         </w:rPr>
-        <w:t xml:space="preserve">Languages: </w:t>
+        <w:t xml:space="preserve">Languages:  </w:t>
       </w:r>
       <w:r>
         <w:rPr>
@@ -641,7 +675,7 @@
           <w:color w:val="0F172A"/>
           <w:sz w:val="19"/>
         </w:rPr>
-        <w:t xml:space="preserve">Frameworks &amp; Tools: </w:t>
+        <w:t xml:space="preserve">Frameworks &amp; Tools:  </w:t>
       </w:r>
       <w:r>
         <w:rPr>
@@ -651,7 +685,7 @@
           <w:color w:val="1E293B"/>
           <w:sz w:val="19"/>
         </w:rPr>
-        <w:t>Open5GS  ·  UERANSIM  ·  Flask  ·  FastAPI  ·  Scapy  ·  CMake  ·  Docker  ·  Kubernetes  ·  libpcap  ·  nDPI  ·  OpenSSL</w:t>
+        <w:t>Open5GS  ·  UERANSIM  ·  Flask  ·  FastAPI  ·  Scapy  ·  Docker  ·  Kubernetes  ·  CMake  ·  libpcap  ·  nDPI  ·  OpenSSL</w:t>
       </w:r>
     </w:p>
     <w:p>
@@ -666,7 +700,7 @@
           <w:color w:val="0F172A"/>
           <w:sz w:val="19"/>
         </w:rPr>
-        <w:t xml:space="preserve">Cloud &amp; Infra: </w:t>
+        <w:t xml:space="preserve">Cloud &amp; Infra:  </w:t>
       </w:r>
       <w:r>
         <w:rPr>
@@ -676,7 +710,7 @@
           <w:color w:val="1E293B"/>
           <w:sz w:val="19"/>
         </w:rPr>
-        <w:t>GCP  ·  GCP Vertex AI  ·  Prometheus  ·  Grafana  ·  MongoDB  ·  OpenStack  ·  Jenkins/CI/CD</w:t>
+        <w:t>GCP  ·  GCP Vertex AI  ·  OpenStack  ·  Prometheus  ·  Grafana  ·  MongoDB  ·  Elasticsearch  ·  Jenkins / CI/CD</w:t>
       </w:r>
     </w:p>
     <w:p>
@@ -691,7 +725,7 @@
           <w:color w:val="0F172A"/>
           <w:sz w:val="19"/>
         </w:rPr>
-        <w:t xml:space="preserve">Mobile: </w:t>
+        <w:t xml:space="preserve">Mobile:  </w:t>
       </w:r>
       <w:r>
         <w:rPr>
@@ -701,35 +735,35 @@
           <w:color w:val="1E293B"/>
           <w:sz w:val="19"/>
         </w:rPr>
-        <w:t>iOS / Swift  ·  CoreMotion  ·  AVFoundation  ·  App Store  ·  On-Device ML</w:t>
+        <w:t>iOS / Swift  ·  CoreMotion  ·  AVFoundation  ·  On-Device ML  ·  App Store</w:t>
       </w:r>
     </w:p>
     <w:p>
       <w:pPr>
-        <w:spacing w:before="40" w:after="40"/>
+        <w:spacing w:before="0" w:after="0"/>
         <w:pBdr>
-          <w:bottom w:val="single" w:sz="4" w:space="1" w:color="BFDBFE"/>
+          <w:bottom w:val="single" w:sz="4" w:space="1" w:color="93C5FD"/>
         </w:pBdr>
       </w:pPr>
     </w:p>
     <w:p>
       <w:pPr>
-        <w:spacing w:before="120" w:after="40"/>
+        <w:spacing w:before="100" w:after="40"/>
       </w:pPr>
       <w:r>
         <w:rPr>
           <w:rFonts w:ascii="Calibri" w:hAnsi="Calibri"/>
           <w:b/>
           <w:i w:val="0"/>
-          <w:color w:val="2563EB"/>
-          <w:sz w:val="18"/>
+          <w:color w:val="1D4ED8"/>
+          <w:sz w:val="17"/>
         </w:rPr>
-        <w:t>OPEN-SOURCE PORTFOLIO HIGHLIGHTS</w:t>
+        <w:t>OPEN-SOURCE PORTFOLIO  ·  GITHUB.COM/CEM8KAYA</w:t>
       </w:r>
     </w:p>
     <w:p>
       <w:pPr>
-        <w:spacing w:before="60" w:after="20"/>
+        <w:spacing w:before="60" w:after="0"/>
       </w:pPr>
       <w:r>
         <w:rPr>
@@ -737,7 +771,7 @@
           <w:b/>
           <w:i w:val="0"/>
           <w:color w:val="0F172A"/>
-          <w:sz w:val="19"/>
+          <w:sz w:val="18"/>
         </w:rPr>
         <w:t xml:space="preserve">Open5GS AI/ML Laboratory  —  </w:t>
       </w:r>
@@ -747,14 +781,14 @@
           <w:b w:val="0"/>
           <w:i w:val="0"/>
           <w:color w:val="1E293B"/>
-          <w:sz w:val="19"/>
+          <w:sz w:val="18"/>
         </w:rPr>
-        <w:t>Full 5G SA core (7 NFs) on GCP with UERANSIM. 8 labeled traffic scenarios, ETL pipeline, Isolation Forest / Random Forest. Documents the gtp5g kernel bypass.</w:t>
+        <w:t>Full 5G SA core (7 NFs) on GCP + UERANSIM. 8 labeled ML traffic scenarios, ETL pipeline, Isolation Forest / Random Forest.</w:t>
       </w:r>
     </w:p>
     <w:p>
       <w:pPr>
-        <w:spacing w:before="60" w:after="20"/>
+        <w:spacing w:before="60" w:after="0"/>
       </w:pPr>
       <w:r>
         <w:rPr>
@@ -762,7 +796,7 @@
           <w:b/>
           <w:i w:val="0"/>
           <w:color w:val="0F172A"/>
-          <w:sz w:val="19"/>
+          <w:sz w:val="18"/>
         </w:rPr>
         <w:t xml:space="preserve">Open5GS NWDAF — C++ Reference  —  </w:t>
       </w:r>
@@ -772,14 +806,14 @@
           <w:b w:val="0"/>
           <w:i w:val="0"/>
           <w:color w:val="1E293B"/>
-          <w:sz w:val="19"/>
+          <w:sz w:val="18"/>
         </w:rPr>
-        <w:t>Standalone C++ NWDAF compliant with 3GPP TS 23.288 v17. All 7 analytics IDs, embedded Isolation Forest + EWMA, full TS 29.520 SBI REST API, systemd service.</w:t>
+        <w:t>Standalone C++ NWDAF per 3GPP TS 23.288 v17. All 7 analytics IDs, embedded Isolation Forest + EWMA, full TS 29.520 SBI REST API, systemd service.</w:t>
       </w:r>
     </w:p>
     <w:p>
       <w:pPr>
-        <w:spacing w:before="60" w:after="20"/>
+        <w:spacing w:before="60" w:after="0"/>
       </w:pPr>
       <w:r>
         <w:rPr>
@@ -787,7 +821,7 @@
           <w:b/>
           <w:i w:val="0"/>
           <w:color w:val="0F172A"/>
-          <w:sz w:val="19"/>
+          <w:sz w:val="18"/>
         </w:rPr>
         <w:t xml:space="preserve">Digital Twin RCA Agent  —  </w:t>
       </w:r>
@@ -797,14 +831,14 @@
           <w:b w:val="0"/>
           <w:i w:val="0"/>
           <w:color w:val="1E293B"/>
-          <w:sz w:val="19"/>
+          <w:sz w:val="18"/>
         </w:rPr>
-        <w:t>LangGraph multi-agent system (Master + 3 specialists) for automated 5G RCA. DTW matching across 15 KPIs, FAISS RAG over 3GPP specs, LLM failover chain. &lt;3 min MTRCA.</w:t>
+        <w:t>LangGraph multi-agent 5G RCA system. DTW matching across 15 KPIs, FAISS RAG over 3GPP specs, LLM failover chain. &lt;3 min MTRCA.</w:t>
       </w:r>
     </w:p>
     <w:p>
       <w:pPr>
-        <w:spacing w:before="60" w:after="20"/>
+        <w:spacing w:before="60" w:after="0"/>
       </w:pPr>
       <w:r>
         <w:rPr>
@@ -812,7 +846,7 @@
           <w:b/>
           <w:i w:val="0"/>
           <w:color w:val="0F172A"/>
-          <w:sz w:val="19"/>
+          <w:sz w:val="18"/>
         </w:rPr>
         <w:t xml:space="preserve">Callflow Visualizer — Enhanced DPI  —  </w:t>
       </w:r>
@@ -822,14 +856,14 @@
           <w:b w:val="0"/>
           <w:i w:val="0"/>
           <w:color w:val="1E293B"/>
-          <w:sz w:val="19"/>
+          <w:sz w:val="18"/>
         </w:rPr>
-        <w:t>C++17 PCAP analyzer with 15+ protocol parsers (SIP/GTP/PFCP/NGAP/NAS/HTTP2). D3.js ladder diagrams, WebSocket streaming, JWT+RBAC. ~34,700 packets/sec.</w:t>
+        <w:t>C++17 PCAP analyser; 15+ protocol parsers (SIP/GTP/PFCP/NGAP/NAS/HTTP2), D3.js ladder diagrams, ~34,700 pkt/s.</w:t>
       </w:r>
     </w:p>
     <w:p>
       <w:pPr>
-        <w:spacing w:before="60" w:after="20"/>
+        <w:spacing w:before="60" w:after="0"/>
       </w:pPr>
       <w:r>
         <w:rPr>
@@ -837,7 +871,7 @@
           <w:b/>
           <w:i w:val="0"/>
           <w:color w:val="0F172A"/>
-          <w:sz w:val="19"/>
+          <w:sz w:val="18"/>
         </w:rPr>
         <w:t xml:space="preserve">5GC Secure CUPS Shield  —  </w:t>
       </w:r>
@@ -847,14 +881,14 @@
           <w:b w:val="0"/>
           <w:i w:val="0"/>
           <w:color w:val="1E293B"/>
-          <w:sz w:val="19"/>
+          <w:sz w:val="18"/>
         </w:rPr>
-        <w:t>PFCP firewall per TS 29.244 / TS 33.513. HMAC-SHA256 auth, RSA signatures, DoS protection, dynamic threat scoring, lock-free atomic design.</w:t>
+        <w:t>PFCP firewall per TS 29.244 / TS 33.513. HMAC-SHA256 auth, DoS protection, dynamic threat scoring.</w:t>
       </w:r>
     </w:p>
     <w:p>
       <w:pPr>
-        <w:spacing w:before="60" w:after="20"/>
+        <w:spacing w:before="60" w:after="0"/>
       </w:pPr>
       <w:r>
         <w:rPr>
@@ -862,7 +896,7 @@
           <w:b/>
           <w:i w:val="0"/>
           <w:color w:val="0F172A"/>
-          <w:sz w:val="19"/>
+          <w:sz w:val="18"/>
         </w:rPr>
         <w:t xml:space="preserve">5G LLM Engine  —  </w:t>
       </w:r>
@@ -872,52 +906,37 @@
           <w:b w:val="0"/>
           <w:i w:val="0"/>
           <w:color w:val="1E293B"/>
-          <w:sz w:val="19"/>
+          <w:sz w:val="18"/>
         </w:rPr>
-        <w:t>QLoRA fine-tuned telecom LLM with FAISS RAG over 3GPP specs. FastAPI output with structured RCA + troubleshooting for AMF/SMF/UPF/IMS/GTPv2.</w:t>
+        <w:t>QLoRA fine-tuned telecom LLM + FAISS RAG over 3GPP specs. FastAPI RCA output for AMF/SMF/IMS/GTP.</w:t>
       </w:r>
     </w:p>
     <w:p>
       <w:pPr>
-        <w:spacing w:before="60" w:after="40"/>
-      </w:pPr>
-      <w:r>
-        <w:rPr>
-          <w:rFonts w:ascii="Calibri" w:hAnsi="Calibri"/>
-          <w:b w:val="0"/>
-          <w:i/>
-          <w:color w:val="475569"/>
-          <w:sz w:val="18"/>
-        </w:rPr>
-        <w:t>All projects: github.com/cem8kaya</w:t>
-      </w:r>
-    </w:p>
-    <w:p>
-      <w:pPr>
-        <w:spacing w:before="40" w:after="40"/>
+        <w:spacing w:before="0" w:after="0"/>
         <w:pBdr>
-          <w:bottom w:val="single" w:sz="4" w:space="1" w:color="BFDBFE"/>
+          <w:bottom w:val="single" w:sz="4" w:space="1" w:color="93C5FD"/>
         </w:pBdr>
       </w:pPr>
     </w:p>
     <w:p>
       <w:pPr>
-        <w:spacing w:before="120" w:after="40"/>
+        <w:spacing w:before="100" w:after="40"/>
       </w:pPr>
       <w:r>
         <w:rPr>
           <w:rFonts w:ascii="Calibri" w:hAnsi="Calibri"/>
           <w:b/>
           <w:i w:val="0"/>
-          <w:color w:val="2563EB"/>
-          <w:sz w:val="18"/>
+          <w:color w:val="1D4ED8"/>
+          <w:sz w:val="17"/>
         </w:rPr>
         <w:t>EDUCATION</w:t>
       </w:r>
     </w:p>
     <w:p>
       <w:pPr>
-        <w:spacing w:before="60" w:after="20"/>
+        <w:spacing w:before="60" w:after="0"/>
       </w:pPr>
       <w:r>
         <w:rPr>
@@ -942,7 +961,7 @@
     </w:p>
     <w:p>
       <w:pPr>
-        <w:spacing w:before="60" w:after="20"/>
+        <w:spacing w:before="60" w:after="0"/>
       </w:pPr>
       <w:r>
         <w:rPr>
@@ -967,23 +986,23 @@
     </w:p>
     <w:p>
       <w:pPr>
-        <w:spacing w:before="40" w:after="40"/>
+        <w:spacing w:before="0" w:after="0"/>
         <w:pBdr>
-          <w:bottom w:val="single" w:sz="4" w:space="1" w:color="BFDBFE"/>
+          <w:bottom w:val="single" w:sz="4" w:space="1" w:color="93C5FD"/>
         </w:pBdr>
       </w:pPr>
     </w:p>
     <w:p>
       <w:pPr>
-        <w:spacing w:before="120" w:after="40"/>
+        <w:spacing w:before="100" w:after="40"/>
       </w:pPr>
       <w:r>
         <w:rPr>
           <w:rFonts w:ascii="Calibri" w:hAnsi="Calibri"/>
           <w:b/>
           <w:i w:val="0"/>
-          <w:color w:val="2563EB"/>
-          <w:sz w:val="18"/>
+          <w:color w:val="1D4ED8"/>
+          <w:sz w:val="17"/>
         </w:rPr>
         <w:t>CERTIFICATIONS</w:t>
       </w:r>
@@ -1000,12 +1019,12 @@
           <w:color w:val="1E293B"/>
           <w:sz w:val="18"/>
         </w:rPr>
-        <w:t>IELTS 7.0 (Advanced English Proficiency)  ·  Nokia Vo5G Protocol Stack &amp; Standards · IMS Protocols and Call Flows  ·  3GPP 5G Security Specification  ·  Business Analyst Certification — Udacity  ·  Python, Machine Learning &amp; Data Visualization — Kaggle</w:t>
+        <w:t>IELTS 7.0  ·  Nokia Vo5G Protocol Stack &amp; Standards / IMS Protocols  ·  3GPP 5G Security Specification  ·  Udacity Business Analyst  ·  Kaggle ML &amp; Python</w:t>
       </w:r>
     </w:p>
     <w:sectPr>
       <w:pgSz w:w="11906" w:h="16838"/>
-      <w:pgMar w:top="850" w:right="1134" w:bottom="850" w:left="1134" w:header="720" w:footer="720" w:gutter="0"/>
+      <w:pgMar w:top="794" w:right="1077" w:bottom="794" w:left="1077" w:header="720" w:footer="720" w:gutter="0"/>
       <w:cols w:space="720"/>
       <w:docGrid w:linePitch="360"/>
     </w:sectPr>

</xml_diff>